<commit_message>
update week04 field map
</commit_message>
<xml_diff>
--- a/docs/Labs/Lab03/Lab03.docx
+++ b/docs/Labs/Lab03/Lab03.docx
@@ -1,6 +1,6 @@
 
 <file path=word/document.xml><?xml version="1.0" encoding="utf-8"?>
-<w:document xmlns:wpc="http://schemas.microsoft.com/office/word/2010/wordprocessingCanvas" xmlns:cx="http://schemas.microsoft.com/office/drawing/2014/chartex" xmlns:cx1="http://schemas.microsoft.com/office/drawing/2015/9/8/chartex" xmlns:cx2="http://schemas.microsoft.com/office/drawing/2015/10/21/chartex" xmlns:cx3="http://schemas.microsoft.com/office/drawing/2016/5/9/chartex" xmlns:cx4="http://schemas.microsoft.com/office/drawing/2016/5/10/chartex" xmlns:cx5="http://schemas.microsoft.com/office/drawing/2016/5/11/chartex" xmlns:cx6="http://schemas.microsoft.com/office/drawing/2016/5/12/chartex" xmlns:cx7="http://schemas.microsoft.com/office/drawing/2016/5/13/chartex" xmlns:cx8="http://schemas.microsoft.com/office/drawing/2016/5/14/chartex" xmlns:mc="http://schemas.openxmlformats.org/markup-compatibility/2006" xmlns:aink="http://schemas.microsoft.com/office/drawing/2016/ink" xmlns:am3d="http://schemas.microsoft.com/office/drawing/2017/model3d" xmlns:o="urn:schemas-microsoft-com:office:office" xmlns:oel="http://schemas.microsoft.com/office/2019/extlst" xmlns:r="http://schemas.openxmlformats.org/officeDocument/2006/relationships" xmlns:m="http://schemas.openxmlformats.org/officeDocument/2006/math" xmlns:v="urn:schemas-microsoft-com:vml" xmlns:wp14="http://schemas.microsoft.com/office/word/2010/wordprocessingDrawing" xmlns:wp="http://schemas.openxmlformats.org/drawingml/2006/wordprocessingDrawing" xmlns:w10="urn:schemas-microsoft-com:office:word" xmlns:w="http://schemas.openxmlformats.org/wordprocessingml/2006/main" xmlns:w14="http://schemas.microsoft.com/office/word/2010/wordml" xmlns:w15="http://schemas.microsoft.com/office/word/2012/wordml" xmlns:w16cex="http://schemas.microsoft.com/office/word/2018/wordml/cex" xmlns:w16cid="http://schemas.microsoft.com/office/word/2016/wordml/cid" xmlns:w16="http://schemas.microsoft.com/office/word/2018/wordml" xmlns:w16du="http://schemas.microsoft.com/office/word/2023/wordml/word16du" xmlns:w16sdtdh="http://schemas.microsoft.com/office/word/2020/wordml/sdtdatahash" xmlns:w16sdtfl="http://schemas.microsoft.com/office/word/2024/wordml/sdtformatlock" xmlns:w16se="http://schemas.microsoft.com/office/word/2015/wordml/symex" xmlns:wpg="http://schemas.microsoft.com/office/word/2010/wordprocessingGroup" xmlns:wpi="http://schemas.microsoft.com/office/word/2010/wordprocessingInk" xmlns:wne="http://schemas.microsoft.com/office/word/2006/wordml" xmlns:wps="http://schemas.microsoft.com/office/word/2010/wordprocessingShape" mc:Ignorable="w14 w15 w16se w16cid w16 w16cex w16sdtdh w16sdtfl w16du wp14">
+<w:document xmlns:wpc="http://schemas.microsoft.com/office/word/2010/wordprocessingCanvas" xmlns:cx="http://schemas.microsoft.com/office/drawing/2014/chartex" xmlns:cx1="http://schemas.microsoft.com/office/drawing/2015/9/8/chartex" xmlns:cx2="http://schemas.microsoft.com/office/drawing/2015/10/21/chartex" xmlns:cx3="http://schemas.microsoft.com/office/drawing/2016/5/9/chartex" xmlns:cx4="http://schemas.microsoft.com/office/drawing/2016/5/10/chartex" xmlns:cx5="http://schemas.microsoft.com/office/drawing/2016/5/11/chartex" xmlns:cx6="http://schemas.microsoft.com/office/drawing/2016/5/12/chartex" xmlns:cx7="http://schemas.microsoft.com/office/drawing/2016/5/13/chartex" xmlns:cx8="http://schemas.microsoft.com/office/drawing/2016/5/14/chartex" xmlns:mc="http://schemas.openxmlformats.org/markup-compatibility/2006" xmlns:aink="http://schemas.microsoft.com/office/drawing/2016/ink" xmlns:am3d="http://schemas.microsoft.com/office/drawing/2017/model3d" xmlns:o="urn:schemas-microsoft-com:office:office" xmlns:oel="http://schemas.microsoft.com/office/2019/extlst" xmlns:r="http://schemas.openxmlformats.org/officeDocument/2006/relationships" xmlns:m="http://schemas.openxmlformats.org/officeDocument/2006/math" xmlns:v="urn:schemas-microsoft-com:vml" xmlns:wp14="http://schemas.microsoft.com/office/word/2010/wordprocessingDrawing" xmlns:wp="http://schemas.openxmlformats.org/drawingml/2006/wordprocessingDrawing" xmlns:w10="urn:schemas-microsoft-com:office:word" xmlns:w="http://schemas.openxmlformats.org/wordprocessingml/2006/main" xmlns:w14="http://schemas.microsoft.com/office/word/2010/wordml" xmlns:w15="http://schemas.microsoft.com/office/word/2012/wordml" xmlns:w16cex="http://schemas.microsoft.com/office/word/2018/wordml/cex" xmlns:w16cid="http://schemas.microsoft.com/office/word/2016/wordml/cid" xmlns:w16="http://schemas.microsoft.com/office/word/2018/wordml" xmlns:w16sdtdh="http://schemas.microsoft.com/office/word/2020/wordml/sdtdatahash" xmlns:w16se="http://schemas.microsoft.com/office/word/2015/wordml/symex" xmlns:wpg="http://schemas.microsoft.com/office/word/2010/wordprocessingGroup" xmlns:wpi="http://schemas.microsoft.com/office/word/2010/wordprocessingInk" xmlns:wne="http://schemas.microsoft.com/office/word/2006/wordml" xmlns:wps="http://schemas.microsoft.com/office/word/2010/wordprocessingShape" mc:Ignorable="w14 w15 w16se w16cid w16 w16cex w16sdtdh wp14">
   <w:body>
     <w:p>
       <w:pPr>
@@ -54,7 +54,33 @@
         <w:rPr>
           <w:lang w:val="en"/>
         </w:rPr>
-        <w:t xml:space="preserve"> Midnight (11:59 pm) on Monday, Sep </w:t>
+        <w:t xml:space="preserve"> Midnight (11:59 pm) </w:t>
+      </w:r>
+      <w:proofErr w:type="spellStart"/>
+      <w:r>
+        <w:rPr>
+          <w:lang w:val="en"/>
+        </w:rPr>
+        <w:t>on</w:t>
+      </w:r>
+      <w:r>
+        <w:rPr>
+          <w:lang w:val="en"/>
+        </w:rPr>
+        <w:t>Thursday</w:t>
+      </w:r>
+      <w:proofErr w:type="spellEnd"/>
+      <w:r>
+        <w:rPr>
+          <w:lang w:val="en"/>
+        </w:rPr>
+        <w:t xml:space="preserve">, Sep </w:t>
+      </w:r>
+      <w:r>
+        <w:rPr>
+          <w:lang w:val="en"/>
+        </w:rPr>
+        <w:t>1</w:t>
       </w:r>
       <w:r>
         <w:rPr>
@@ -76,8 +102,9 @@
           <w:iCs/>
           <w:lang w:val="en"/>
         </w:rPr>
-        <w:t>Lab0</w:t>
-      </w:r>
+        <w:t>Lab</w:t>
+      </w:r>
+      <w:proofErr w:type="gramStart"/>
       <w:r>
         <w:rPr>
           <w:b/>
@@ -86,7 +113,7 @@
           <w:iCs/>
           <w:lang w:val="en"/>
         </w:rPr>
-        <w:t>2</w:t>
+        <w:t>0</w:t>
       </w:r>
       <w:r>
         <w:rPr>
@@ -96,6 +123,16 @@
           <w:iCs/>
           <w:lang w:val="en"/>
         </w:rPr>
+        <w:t>3</w:t>
+      </w:r>
+      <w:r>
+        <w:rPr>
+          <w:b/>
+          <w:bCs/>
+          <w:i/>
+          <w:iCs/>
+          <w:lang w:val="en"/>
+        </w:rPr>
         <w:t xml:space="preserve"> </w:t>
       </w:r>
       <w:r>
@@ -104,6 +141,7 @@
         </w:rPr>
         <w:t xml:space="preserve"> link</w:t>
       </w:r>
+      <w:proofErr w:type="gramEnd"/>
     </w:p>
     <w:p>
       <w:pPr>
@@ -180,7 +218,7 @@
       </w:tblGrid>
       <w:tr>
         <w:trPr>
-          <w:trHeight w:val="2129"/>
+          <w:trHeight w:val="1518"/>
         </w:trPr>
         <w:tc>
           <w:tcPr>
@@ -217,7 +255,13 @@
               <w:ind w:hanging="360"/>
             </w:pPr>
             <w:r>
-              <w:t>How to log into Survey123 with ArcGIS online account</w:t>
+              <w:t xml:space="preserve">How to log into </w:t>
+            </w:r>
+            <w:r>
+              <w:t>Field Map Designer</w:t>
+            </w:r>
+            <w:r>
+              <w:t xml:space="preserve"> with ArcGIS online account</w:t>
             </w:r>
           </w:p>
           <w:p>
@@ -256,28 +300,16 @@
               <w:ind w:hanging="360"/>
             </w:pPr>
             <w:r>
-              <w:t>How to access your survey in TDC 100</w:t>
+              <w:t xml:space="preserve">How to access your </w:t>
+            </w:r>
+            <w:r>
+              <w:t xml:space="preserve">Field Map </w:t>
             </w:r>
           </w:p>
-          <w:p>
-            <w:pPr>
-              <w:numPr>
-                <w:ilvl w:val="0"/>
-                <w:numId w:val="1"/>
-              </w:numPr>
-              <w:spacing w:line="259" w:lineRule="auto"/>
-              <w:ind w:hanging="360"/>
-            </w:pPr>
-            <w:r>
-              <w:t>How to create offline basemap for collecting data offline</w:t>
-            </w:r>
-          </w:p>
-          <w:p/>
         </w:tc>
       </w:tr>
     </w:tbl>
     <w:p/>
-    <w:p/>
     <w:p>
       <w:pPr>
         <w:rPr>
@@ -434,7 +466,6 @@
         </w:numPr>
       </w:pPr>
       <w:r>
-        <w:lastRenderedPageBreak/>
         <w:t>Configure the layers to prevent any mobile worker from modifying data collected by others.</w:t>
       </w:r>
     </w:p>
@@ -448,6 +479,9 @@
       </w:pPr>
       <w:r>
         <w:t>Data collection:</w:t>
+      </w:r>
+      <w:r>
+        <w:t xml:space="preserve"> </w:t>
       </w:r>
     </w:p>
     <w:p>
@@ -459,6 +493,7 @@
         </w:numPr>
       </w:pPr>
       <w:r>
+        <w:lastRenderedPageBreak/>
         <w:t>Collect some features using Field Maps mobile app to test your forms and web map.</w:t>
       </w:r>
     </w:p>
@@ -505,13 +540,24 @@
         <w:ind w:left="720"/>
       </w:pPr>
       <w:r>
-        <w:t>The Maps page displays</w:t>
+        <w:t xml:space="preserve">The Maps page </w:t>
+      </w:r>
+      <w:proofErr w:type="gramStart"/>
+      <w:r>
+        <w:t>displays</w:t>
       </w:r>
       <w:r>
         <w:rPr>
           <w:rFonts w:hint="eastAsia"/>
         </w:rPr>
-        <w:t xml:space="preserve">  (Your map displays are different from mine based on the maps that available in your account)</w:t>
+        <w:t xml:space="preserve">  (</w:t>
+      </w:r>
+      <w:proofErr w:type="gramEnd"/>
+      <w:r>
+        <w:rPr>
+          <w:rFonts w:hint="eastAsia"/>
+        </w:rPr>
+        <w:t>Your map displays are different from mine based on the maps that available in your account)</w:t>
       </w:r>
       <w:r>
         <w:t xml:space="preserve"> all the maps you own or have privileges to edit.</w:t>
@@ -709,15 +755,101 @@
     </w:p>
     <w:p>
       <w:r>
+        <w:t>The Layer Settings tab appears. these settings allow you to configure tasks, high-accuracy GPS metadata fields, and z-value and m-value enabled geometries. Tasks are discussed in chapter 6. You don’t need to change these default settings.</w:t>
+      </w:r>
+    </w:p>
+    <w:p>
+      <w:r>
+        <w:t>Next, you will define the layer’s coordinate system.</w:t>
+      </w:r>
+    </w:p>
+    <w:p>
+      <w:pPr>
+        <w:pStyle w:val="ListParagraph"/>
+        <w:numPr>
+          <w:ilvl w:val="0"/>
+          <w:numId w:val="10"/>
+        </w:numPr>
+      </w:pPr>
+      <w:r>
         <w:lastRenderedPageBreak/>
-        <w:t>The Layer Settings tab appears. these settings allow you to configure tasks, high-accuracy GPS metadata fields, and z-value and m-value enabled geometries. Tasks are discussed in chapter 6. You don’t need to change these default settings.</w:t>
-      </w:r>
-    </w:p>
-    <w:p>
-      <w:r>
-        <w:t>Next, you will define the layer’s coordinate system.</w:t>
-      </w:r>
-    </w:p>
+        <w:t>On the Layer Settings tab, apply the following settings:</w:t>
+      </w:r>
+    </w:p>
+    <w:p>
+      <w:pPr>
+        <w:pStyle w:val="ListParagraph"/>
+        <w:numPr>
+          <w:ilvl w:val="0"/>
+          <w:numId w:val="11"/>
+        </w:numPr>
+      </w:pPr>
+      <w:r>
+        <w:t>Click Advanced settings, expand the Set Coordinate System drop-down list, choose Use a Coordinate System, and click Browse.</w:t>
+      </w:r>
+    </w:p>
+    <w:p>
+      <w:pPr>
+        <w:pStyle w:val="ListParagraph"/>
+        <w:numPr>
+          <w:ilvl w:val="0"/>
+          <w:numId w:val="11"/>
+        </w:numPr>
+      </w:pPr>
+      <w:r>
+        <w:t>In the Coordinate Systems window, search for Web Mercator.</w:t>
+      </w:r>
+    </w:p>
+    <w:p>
+      <w:pPr>
+        <w:pStyle w:val="ListParagraph"/>
+        <w:numPr>
+          <w:ilvl w:val="0"/>
+          <w:numId w:val="11"/>
+        </w:numPr>
+      </w:pPr>
+      <w:r>
+        <w:t>In the search result, choose WGS 1984 Web Mercator (auxiliary sphere).</w:t>
+      </w:r>
+    </w:p>
+    <w:p>
+      <w:pPr>
+        <w:pStyle w:val="ListParagraph"/>
+        <w:numPr>
+          <w:ilvl w:val="0"/>
+          <w:numId w:val="11"/>
+        </w:numPr>
+      </w:pPr>
+      <w:r>
+        <w:t>Click Done.</w:t>
+      </w:r>
+    </w:p>
+    <w:p>
+      <w:pPr>
+        <w:pStyle w:val="ListParagraph"/>
+        <w:numPr>
+          <w:ilvl w:val="0"/>
+          <w:numId w:val="11"/>
+        </w:numPr>
+      </w:pPr>
+      <w:r>
+        <w:t>Click Next.</w:t>
+      </w:r>
+    </w:p>
+    <w:p>
+      <w:r>
+        <w:t xml:space="preserve">The Title and Save tab </w:t>
+      </w:r>
+      <w:proofErr w:type="gramStart"/>
+      <w:r>
+        <w:t>appears</w:t>
+      </w:r>
+      <w:proofErr w:type="gramEnd"/>
+      <w:r>
+        <w:t>. Here you will set the title of the web map, which is the map name that your mobile workers will see, and the title of the host feature layer, which will include the point, line, and polygon assets sub-layers you defined above.</w:t>
+      </w:r>
+    </w:p>
+    <w:p/>
     <w:p>
       <w:pPr>
         <w:pStyle w:val="ListParagraph"/>
@@ -727,84 +859,6 @@
         </w:numPr>
       </w:pPr>
       <w:r>
-        <w:t>On the Layer Settings tab, apply the following settings:</w:t>
-      </w:r>
-    </w:p>
-    <w:p>
-      <w:pPr>
-        <w:pStyle w:val="ListParagraph"/>
-        <w:numPr>
-          <w:ilvl w:val="0"/>
-          <w:numId w:val="11"/>
-        </w:numPr>
-      </w:pPr>
-      <w:r>
-        <w:t>Click Advanced settings, expand the Set Coordinate System drop-down list, choose Use a Coordinate System, and click Browse.</w:t>
-      </w:r>
-    </w:p>
-    <w:p>
-      <w:pPr>
-        <w:pStyle w:val="ListParagraph"/>
-        <w:numPr>
-          <w:ilvl w:val="0"/>
-          <w:numId w:val="11"/>
-        </w:numPr>
-      </w:pPr>
-      <w:r>
-        <w:t>In the Coordinate Systems window, search for Web Mercator.</w:t>
-      </w:r>
-    </w:p>
-    <w:p>
-      <w:pPr>
-        <w:pStyle w:val="ListParagraph"/>
-        <w:numPr>
-          <w:ilvl w:val="0"/>
-          <w:numId w:val="11"/>
-        </w:numPr>
-      </w:pPr>
-      <w:r>
-        <w:t>In the search result, choose WGS 1984 Web Mercator (auxiliary sphere).</w:t>
-      </w:r>
-    </w:p>
-    <w:p>
-      <w:pPr>
-        <w:pStyle w:val="ListParagraph"/>
-        <w:numPr>
-          <w:ilvl w:val="0"/>
-          <w:numId w:val="11"/>
-        </w:numPr>
-      </w:pPr>
-      <w:r>
-        <w:t>Click Done.</w:t>
-      </w:r>
-    </w:p>
-    <w:p>
-      <w:pPr>
-        <w:pStyle w:val="ListParagraph"/>
-        <w:numPr>
-          <w:ilvl w:val="0"/>
-          <w:numId w:val="11"/>
-        </w:numPr>
-      </w:pPr>
-      <w:r>
-        <w:t>Click Next.</w:t>
-      </w:r>
-    </w:p>
-    <w:p>
-      <w:r>
-        <w:t>The Title and Save tab appears. Here you will set the title of the web map, which is the map name that your mobile workers will see, and the title of the host feature layer, which will include the point, line, and polygon assets sub-layers you defined above.</w:t>
-      </w:r>
-    </w:p>
-    <w:p/>
-    <w:p>
-      <w:pPr>
-        <w:pStyle w:val="ListParagraph"/>
-        <w:numPr>
-          <w:ilvl w:val="0"/>
-          <w:numId w:val="10"/>
-        </w:numPr>
-      </w:pPr>
-      <w:r>
         <w:t>On the Title and Save tab, apply the following settings:</w:t>
       </w:r>
     </w:p>
@@ -844,13 +898,24 @@
         <w:t xml:space="preserve">For Folder, click Create New Folder, type </w:t>
       </w:r>
       <w:r>
-        <w:t>Week 05 Field Map</w:t>
+        <w:t xml:space="preserve">Week 05 Field </w:t>
+      </w:r>
+      <w:proofErr w:type="spellStart"/>
+      <w:r>
+        <w:t>Map</w:t>
       </w:r>
       <w:r>
         <w:rPr>
           <w:rFonts w:hint="eastAsia"/>
         </w:rPr>
-        <w:t>_YourInitial (</w:t>
+        <w:t>_YourInitial</w:t>
+      </w:r>
+      <w:proofErr w:type="spellEnd"/>
+      <w:r>
+        <w:rPr>
+          <w:rFonts w:hint="eastAsia"/>
+        </w:rPr>
+        <w:t xml:space="preserve"> (</w:t>
       </w:r>
       <w:r>
         <w:t>The feature layer title needs to be unique in your ArcGIS Online organization</w:t>
@@ -900,16 +965,10 @@
       </w:r>
     </w:p>
     <w:p>
-      <w:pPr>
-        <w:rPr>
-          <w:rFonts w:hint="eastAsia"/>
-        </w:rPr>
-      </w:pPr>
       <w:r>
         <w:rPr>
           <w:noProof/>
         </w:rPr>
-        <w:lastRenderedPageBreak/>
         <w:drawing>
           <wp:inline distT="0" distB="0" distL="0" distR="0" wp14:anchorId="45E43583" wp14:editId="43D6F0E8">
             <wp:extent cx="5943600" cy="2713990"/>
@@ -956,6 +1015,7 @@
         <w:rPr>
           <w:rFonts w:hint="eastAsia"/>
         </w:rPr>
+        <w:lastRenderedPageBreak/>
         <w:t>Step 2</w:t>
       </w:r>
       <w:r>
@@ -1054,7 +1114,6 @@
         <w:ind w:left="720"/>
       </w:pPr>
       <w:r>
-        <w:lastRenderedPageBreak/>
         <w:t>If you have closed the browser, go to ArcGIS Online, sign in, click the app launcher, click Field Maps Designer, and click the map you just created.</w:t>
       </w:r>
     </w:p>
@@ -1160,6 +1219,7 @@
         <w:rPr>
           <w:noProof/>
         </w:rPr>
+        <w:lastRenderedPageBreak/>
         <w:drawing>
           <wp:inline distT="0" distB="0" distL="0" distR="0" wp14:anchorId="753EF076" wp14:editId="16FD0280">
             <wp:extent cx="4426474" cy="2361732"/>
@@ -1207,7 +1267,15 @@
         <w:ind w:left="1440"/>
       </w:pPr>
       <w:r>
-        <w:t>In the Formatting section, for Display Name, type Category. The Field name will be autofilled as the Display name.</w:t>
+        <w:t xml:space="preserve">In the Formatting section, for Display Name, type Category. The Field name will be </w:t>
+      </w:r>
+      <w:proofErr w:type="spellStart"/>
+      <w:r>
+        <w:t>autofilled</w:t>
+      </w:r>
+      <w:proofErr w:type="spellEnd"/>
+      <w:r>
+        <w:t xml:space="preserve"> as the Display name.</w:t>
       </w:r>
     </w:p>
     <w:p>
@@ -1291,7 +1359,6 @@
         <w:rPr>
           <w:noProof/>
         </w:rPr>
-        <w:lastRenderedPageBreak/>
         <w:drawing>
           <wp:inline distT="0" distB="0" distL="0" distR="0" wp14:anchorId="49C67A4C" wp14:editId="3150C993">
             <wp:extent cx="4927251" cy="2793688"/>
@@ -1365,6 +1432,7 @@
         <w:ind w:left="1440"/>
       </w:pPr>
       <w:r>
+        <w:lastRenderedPageBreak/>
         <w:t>If prompted with a dialog box asking if you want to continue, click Continue.</w:t>
       </w:r>
     </w:p>
@@ -1535,7 +1603,6 @@
         <w:rPr>
           <w:noProof/>
         </w:rPr>
-        <w:lastRenderedPageBreak/>
         <w:drawing>
           <wp:inline distT="0" distB="0" distL="0" distR="0" wp14:anchorId="11CC5307" wp14:editId="58E69C31">
             <wp:extent cx="4908589" cy="1838099"/>
@@ -1651,6 +1718,7 @@
         </w:numPr>
       </w:pPr>
       <w:r>
+        <w:lastRenderedPageBreak/>
         <w:t>In the Formatting section, for Display Name, type Condition.</w:t>
       </w:r>
     </w:p>
@@ -1790,7 +1858,6 @@
         </w:numPr>
       </w:pPr>
       <w:r>
-        <w:lastRenderedPageBreak/>
         <w:t>In the Form builder pane, drag a Switch element to the form, under the Condition element.</w:t>
       </w:r>
     </w:p>
@@ -1957,6 +2024,7 @@
         </w:numPr>
       </w:pPr>
       <w:r>
+        <w:lastRenderedPageBreak/>
         <w:t>Close the Properties pane.</w:t>
       </w:r>
     </w:p>
@@ -2073,7 +2141,15 @@
         </w:numPr>
       </w:pPr>
       <w:r>
-        <w:t>In the Form builder pane, drag a Text – Single Line element to the form, under the City element.</w:t>
+        <w:t xml:space="preserve">In the Form builder pane, drag a Text – Single Line element to the form, under the </w:t>
+      </w:r>
+      <w:proofErr w:type="gramStart"/>
+      <w:r>
+        <w:t>City</w:t>
+      </w:r>
+      <w:proofErr w:type="gramEnd"/>
+      <w:r>
+        <w:t xml:space="preserve"> element.</w:t>
       </w:r>
     </w:p>
     <w:p>
@@ -2129,7 +2205,6 @@
         <w:ind w:left="360"/>
       </w:pPr>
       <w:r>
-        <w:lastRenderedPageBreak/>
         <w:t>Next, you will configure the line and polygon assets layers by adding a Category element.</w:t>
       </w:r>
     </w:p>
@@ -2369,7 +2444,6 @@
         </w:numPr>
       </w:pPr>
       <w:r>
-        <w:lastRenderedPageBreak/>
         <w:t>Under Layers, click Point Assets.</w:t>
       </w:r>
     </w:p>
@@ -2474,6 +2548,7 @@
         <w:rPr>
           <w:noProof/>
         </w:rPr>
+        <w:lastRenderedPageBreak/>
         <w:drawing>
           <wp:inline distT="0" distB="0" distL="0" distR="0" wp14:anchorId="20902F7E" wp14:editId="49179B53">
             <wp:extent cx="2720761" cy="2236603"/>
@@ -2623,7 +2698,6 @@
         <w:ind w:left="1440"/>
       </w:pPr>
       <w:r>
-        <w:lastRenderedPageBreak/>
         <w:t>Observe that the following Arcade syntax is built for you automatically:</w:t>
       </w:r>
     </w:p>
@@ -2635,12 +2709,30 @@
           <w:shd w:val="pct15" w:color="auto" w:fill="FFFFFF"/>
         </w:rPr>
       </w:pPr>
+      <w:proofErr w:type="spellStart"/>
+      <w:proofErr w:type="gramStart"/>
       <w:r>
         <w:rPr>
           <w:rFonts w:ascii="Times New Roman" w:hAnsi="Times New Roman" w:cs="Times New Roman"/>
           <w:shd w:val="pct15" w:color="auto" w:fill="FFFFFF"/>
         </w:rPr>
-        <w:t>DomainName($feature, "Condition") == "Poor"</w:t>
+        <w:t>DomainName</w:t>
+      </w:r>
+      <w:proofErr w:type="spellEnd"/>
+      <w:r>
+        <w:rPr>
+          <w:rFonts w:ascii="Times New Roman" w:hAnsi="Times New Roman" w:cs="Times New Roman"/>
+          <w:shd w:val="pct15" w:color="auto" w:fill="FFFFFF"/>
+        </w:rPr>
+        <w:t>(</w:t>
+      </w:r>
+      <w:proofErr w:type="gramEnd"/>
+      <w:r>
+        <w:rPr>
+          <w:rFonts w:ascii="Times New Roman" w:hAnsi="Times New Roman" w:cs="Times New Roman"/>
+          <w:shd w:val="pct15" w:color="auto" w:fill="FFFFFF"/>
+        </w:rPr>
+        <w:t>$feature, "Condition") == "Poor"</w:t>
       </w:r>
     </w:p>
     <w:p>
@@ -2661,7 +2753,17 @@
         <w:ind w:left="360"/>
       </w:pPr>
       <w:r>
-        <w:t>The Arcade line of code checks if the Condition attribute value of the current feature being collected is labeled Poor. Because the labels and the codes of the Condition attribute are the same, the code can evaluate the code—in other words, the attribute value—directly, and thus the line of script can also be written as $feature["Condition"] == "Poor", or yet another way as $feature.Condition == "Poor".</w:t>
+        <w:t>The Arcade line of code checks if the Condition attribute value of the current feature being collected is labeled Poor. Because the labels and the codes of the Condition attribute are the same, the code can evaluate the code—in other words, the attribute value—directly, and thus the line of script can also be written as $feature["Condition"] == "Poor", or yet another way as $</w:t>
+      </w:r>
+      <w:proofErr w:type="spellStart"/>
+      <w:proofErr w:type="gramStart"/>
+      <w:r>
+        <w:t>feature.Condition</w:t>
+      </w:r>
+      <w:proofErr w:type="spellEnd"/>
+      <w:proofErr w:type="gramEnd"/>
+      <w:r>
+        <w:t xml:space="preserve"> == "Poor".</w:t>
       </w:r>
     </w:p>
     <w:p>
@@ -2755,6 +2857,7 @@
         </w:numPr>
       </w:pPr>
       <w:r>
+        <w:lastRenderedPageBreak/>
         <w:t>Choose the Condition field, the is operator, and the value Fair.</w:t>
       </w:r>
     </w:p>
@@ -2850,12 +2953,30 @@
           <w:shd w:val="pct15" w:color="auto" w:fill="FFFFFF"/>
         </w:rPr>
       </w:pPr>
+      <w:proofErr w:type="spellStart"/>
+      <w:proofErr w:type="gramStart"/>
       <w:r>
         <w:rPr>
           <w:rFonts w:ascii="Times New Roman" w:hAnsi="Times New Roman" w:cs="Times New Roman"/>
           <w:shd w:val="pct15" w:color="auto" w:fill="FFFFFF"/>
         </w:rPr>
-        <w:t xml:space="preserve">DomainName($feature, "Condition") == "Fair" || </w:t>
+        <w:t>DomainName</w:t>
+      </w:r>
+      <w:proofErr w:type="spellEnd"/>
+      <w:r>
+        <w:rPr>
+          <w:rFonts w:ascii="Times New Roman" w:hAnsi="Times New Roman" w:cs="Times New Roman"/>
+          <w:shd w:val="pct15" w:color="auto" w:fill="FFFFFF"/>
+        </w:rPr>
+        <w:t>(</w:t>
+      </w:r>
+      <w:proofErr w:type="gramEnd"/>
+      <w:r>
+        <w:rPr>
+          <w:rFonts w:ascii="Times New Roman" w:hAnsi="Times New Roman" w:cs="Times New Roman"/>
+          <w:shd w:val="pct15" w:color="auto" w:fill="FFFFFF"/>
+        </w:rPr>
+        <w:t xml:space="preserve">$feature, "Condition") == "Fair" || </w:t>
       </w:r>
     </w:p>
     <w:p>
@@ -2867,12 +2988,30 @@
           <w:shd w:val="pct15" w:color="auto" w:fill="FFFFFF"/>
         </w:rPr>
       </w:pPr>
+      <w:proofErr w:type="spellStart"/>
+      <w:proofErr w:type="gramStart"/>
       <w:r>
         <w:rPr>
           <w:rFonts w:ascii="Times New Roman" w:hAnsi="Times New Roman" w:cs="Times New Roman"/>
           <w:shd w:val="pct15" w:color="auto" w:fill="FFFFFF"/>
         </w:rPr>
-        <w:t>DomainName($feature, "Condition") == "Poor"</w:t>
+        <w:t>DomainName</w:t>
+      </w:r>
+      <w:proofErr w:type="spellEnd"/>
+      <w:r>
+        <w:rPr>
+          <w:rFonts w:ascii="Times New Roman" w:hAnsi="Times New Roman" w:cs="Times New Roman"/>
+          <w:shd w:val="pct15" w:color="auto" w:fill="FFFFFF"/>
+        </w:rPr>
+        <w:t>(</w:t>
+      </w:r>
+      <w:proofErr w:type="gramEnd"/>
+      <w:r>
+        <w:rPr>
+          <w:rFonts w:ascii="Times New Roman" w:hAnsi="Times New Roman" w:cs="Times New Roman"/>
+          <w:shd w:val="pct15" w:color="auto" w:fill="FFFFFF"/>
+        </w:rPr>
+        <w:t>$feature, "Condition") == "Poor"</w:t>
       </w:r>
     </w:p>
     <w:p>
@@ -2908,7 +3047,41 @@
           <w:rFonts w:ascii="Times New Roman" w:hAnsi="Times New Roman" w:cs="Times New Roman"/>
           <w:shd w:val="pct15" w:color="auto" w:fill="FFFFFF"/>
         </w:rPr>
-        <w:t>$feature["Condition"] == "Fair" || $feature["Condition"] == "Poor", or $feature.Condition == "Fair" || $feature.Condition == "Poor".</w:t>
+        <w:t>$feature["Condition"] == "Fair" || $feature["Condition"] == "Poor", or $</w:t>
+      </w:r>
+      <w:proofErr w:type="spellStart"/>
+      <w:proofErr w:type="gramStart"/>
+      <w:r>
+        <w:rPr>
+          <w:rFonts w:ascii="Times New Roman" w:hAnsi="Times New Roman" w:cs="Times New Roman"/>
+          <w:shd w:val="pct15" w:color="auto" w:fill="FFFFFF"/>
+        </w:rPr>
+        <w:t>feature.Condition</w:t>
+      </w:r>
+      <w:proofErr w:type="spellEnd"/>
+      <w:proofErr w:type="gramEnd"/>
+      <w:r>
+        <w:rPr>
+          <w:rFonts w:ascii="Times New Roman" w:hAnsi="Times New Roman" w:cs="Times New Roman"/>
+          <w:shd w:val="pct15" w:color="auto" w:fill="FFFFFF"/>
+        </w:rPr>
+        <w:t xml:space="preserve"> == "Fair" || $</w:t>
+      </w:r>
+      <w:proofErr w:type="spellStart"/>
+      <w:r>
+        <w:rPr>
+          <w:rFonts w:ascii="Times New Roman" w:hAnsi="Times New Roman" w:cs="Times New Roman"/>
+          <w:shd w:val="pct15" w:color="auto" w:fill="FFFFFF"/>
+        </w:rPr>
+        <w:t>feature.Condition</w:t>
+      </w:r>
+      <w:proofErr w:type="spellEnd"/>
+      <w:r>
+        <w:rPr>
+          <w:rFonts w:ascii="Times New Roman" w:hAnsi="Times New Roman" w:cs="Times New Roman"/>
+          <w:shd w:val="pct15" w:color="auto" w:fill="FFFFFF"/>
+        </w:rPr>
+        <w:t xml:space="preserve"> == "Poor".</w:t>
       </w:r>
     </w:p>
     <w:p>
@@ -2945,7 +3118,6 @@
         </w:numPr>
       </w:pPr>
       <w:r>
-        <w:lastRenderedPageBreak/>
         <w:t>In the Properties pane, next to the Visible check box, click the Settings button.</w:t>
       </w:r>
     </w:p>
@@ -3058,12 +3230,46 @@
           <w:shd w:val="pct15" w:color="auto" w:fill="FFFFFF"/>
         </w:rPr>
       </w:pPr>
+      <w:proofErr w:type="spellStart"/>
+      <w:proofErr w:type="gramStart"/>
       <w:r>
         <w:rPr>
           <w:rFonts w:ascii="Times New Roman" w:hAnsi="Times New Roman" w:cs="Times New Roman"/>
           <w:shd w:val="pct15" w:color="auto" w:fill="FFFFFF"/>
         </w:rPr>
-        <w:t>DomainName($feature, "Need_Maintenance") == "Yes".</w:t>
+        <w:t>DomainName</w:t>
+      </w:r>
+      <w:proofErr w:type="spellEnd"/>
+      <w:r>
+        <w:rPr>
+          <w:rFonts w:ascii="Times New Roman" w:hAnsi="Times New Roman" w:cs="Times New Roman"/>
+          <w:shd w:val="pct15" w:color="auto" w:fill="FFFFFF"/>
+        </w:rPr>
+        <w:t>(</w:t>
+      </w:r>
+      <w:proofErr w:type="gramEnd"/>
+      <w:r>
+        <w:rPr>
+          <w:rFonts w:ascii="Times New Roman" w:hAnsi="Times New Roman" w:cs="Times New Roman"/>
+          <w:shd w:val="pct15" w:color="auto" w:fill="FFFFFF"/>
+        </w:rPr>
+        <w:t>$feature, "</w:t>
+      </w:r>
+      <w:proofErr w:type="spellStart"/>
+      <w:r>
+        <w:rPr>
+          <w:rFonts w:ascii="Times New Roman" w:hAnsi="Times New Roman" w:cs="Times New Roman"/>
+          <w:shd w:val="pct15" w:color="auto" w:fill="FFFFFF"/>
+        </w:rPr>
+        <w:t>Need_Maintenance</w:t>
+      </w:r>
+      <w:proofErr w:type="spellEnd"/>
+      <w:r>
+        <w:rPr>
+          <w:rFonts w:ascii="Times New Roman" w:hAnsi="Times New Roman" w:cs="Times New Roman"/>
+          <w:shd w:val="pct15" w:color="auto" w:fill="FFFFFF"/>
+        </w:rPr>
+        <w:t>") == "Yes".</w:t>
       </w:r>
     </w:p>
     <w:p>
@@ -3095,6 +3301,7 @@
         </w:numPr>
       </w:pPr>
       <w:r>
+        <w:lastRenderedPageBreak/>
         <w:t>Click the Inspector element.</w:t>
       </w:r>
     </w:p>
@@ -3190,7 +3397,23 @@
         </w:numPr>
       </w:pPr>
       <w:r>
-        <w:t>Click the Functions button (fx) on the right side of the window. Search for GetUser. In the search result, notice the multiple ways to get user info.</w:t>
+        <w:t>Click the Functions button (</w:t>
+      </w:r>
+      <w:proofErr w:type="spellStart"/>
+      <w:r>
+        <w:t>fx</w:t>
+      </w:r>
+      <w:proofErr w:type="spellEnd"/>
+      <w:r>
+        <w:t xml:space="preserve">) on the right side of the window. Search for </w:t>
+      </w:r>
+      <w:proofErr w:type="spellStart"/>
+      <w:r>
+        <w:t>GetUser</w:t>
+      </w:r>
+      <w:proofErr w:type="spellEnd"/>
+      <w:r>
+        <w:t>. In the search result, notice the multiple ways to get user info.</w:t>
       </w:r>
     </w:p>
     <w:p>
@@ -3248,8 +3471,25 @@
         </w:numPr>
       </w:pPr>
       <w:r>
-        <w:lastRenderedPageBreak/>
-        <w:t>Under Portal Functions, notice GetUser(portalObjects?, username?). Click the arrow button on the right to learn more about it.</w:t>
+        <w:t xml:space="preserve">Under Portal Functions, notice </w:t>
+      </w:r>
+      <w:proofErr w:type="spellStart"/>
+      <w:proofErr w:type="gramStart"/>
+      <w:r>
+        <w:t>GetUser</w:t>
+      </w:r>
+      <w:proofErr w:type="spellEnd"/>
+      <w:r>
+        <w:t>(</w:t>
+      </w:r>
+      <w:proofErr w:type="spellStart"/>
+      <w:proofErr w:type="gramEnd"/>
+      <w:r>
+        <w:t>portalObjects</w:t>
+      </w:r>
+      <w:proofErr w:type="spellEnd"/>
+      <w:r>
+        <w:t>?, username?). Click the arrow button on the right to learn more about it.</w:t>
       </w:r>
     </w:p>
     <w:p>
@@ -3284,13 +3524,40 @@
         </w:rPr>
         <w:t>：</w:t>
       </w:r>
+      <w:proofErr w:type="spellStart"/>
+      <w:proofErr w:type="gramStart"/>
       <w:r>
         <w:rPr>
           <w:rFonts w:ascii="Times New Roman" w:hAnsi="Times New Roman" w:cs="Times New Roman"/>
           <w:shd w:val="pct15" w:color="auto" w:fill="FFFFFF"/>
         </w:rPr>
-        <w:t>GetUser(Portal(‘https://arcgis.com’)).fullName</w:t>
-      </w:r>
+        <w:t>GetUser</w:t>
+      </w:r>
+      <w:proofErr w:type="spellEnd"/>
+      <w:r>
+        <w:rPr>
+          <w:rFonts w:ascii="Times New Roman" w:hAnsi="Times New Roman" w:cs="Times New Roman"/>
+          <w:shd w:val="pct15" w:color="auto" w:fill="FFFFFF"/>
+        </w:rPr>
+        <w:t>(</w:t>
+      </w:r>
+      <w:proofErr w:type="gramEnd"/>
+      <w:r>
+        <w:rPr>
+          <w:rFonts w:ascii="Times New Roman" w:hAnsi="Times New Roman" w:cs="Times New Roman"/>
+          <w:shd w:val="pct15" w:color="auto" w:fill="FFFFFF"/>
+        </w:rPr>
+        <w:t>Portal(‘https://arcgis.com’)).</w:t>
+      </w:r>
+      <w:proofErr w:type="spellStart"/>
+      <w:r>
+        <w:rPr>
+          <w:rFonts w:ascii="Times New Roman" w:hAnsi="Times New Roman" w:cs="Times New Roman"/>
+          <w:shd w:val="pct15" w:color="auto" w:fill="FFFFFF"/>
+        </w:rPr>
+        <w:t>fullName</w:t>
+      </w:r>
+      <w:proofErr w:type="spellEnd"/>
     </w:p>
     <w:p>
       <w:pPr>
@@ -3367,6 +3634,7 @@
         <w:ind w:left="360"/>
       </w:pPr>
       <w:r>
+        <w:lastRenderedPageBreak/>
         <w:t>Next, you will calculate the city that the asset location is within. You will add the cities layer to the map so that Arcade can access the layer more easily.</w:t>
       </w:r>
     </w:p>
@@ -3488,16 +3756,7 @@
           <w:iCs/>
           <w:shd w:val="pct15" w:color="auto" w:fill="FFFFFF"/>
         </w:rPr>
-        <w:t xml:space="preserve">Map Viewer has two vertical toolbars on the left and right sides of the view. The dark toolbar on the left is the Contents toolbar. This is used for managing layers and tables. The light toolbar on the right is the Settings toolbar. This is used to access options for </w:t>
-      </w:r>
-      <w:r>
-        <w:rPr>
-          <w:i/>
-          <w:iCs/>
-          <w:shd w:val="pct15" w:color="auto" w:fill="FFFFFF"/>
-        </w:rPr>
-        <w:lastRenderedPageBreak/>
-        <w:t>configuring and interacting with map layers. there are Expand and Collapse buttons at the bottom of each toolbar to expand or collapse them.</w:t>
+        <w:t>Map Viewer has two vertical toolbars on the left and right sides of the view. The dark toolbar on the left is the Contents toolbar. This is used for managing layers and tables. The light toolbar on the right is the Settings toolbar. This is used to access options for configuring and interacting with map layers. there are Expand and Collapse buttons at the bottom of each toolbar to expand or collapse them.</w:t>
       </w:r>
     </w:p>
     <w:p>
@@ -3599,6 +3858,7 @@
         <w:rPr>
           <w:noProof/>
         </w:rPr>
+        <w:lastRenderedPageBreak/>
         <w:drawing>
           <wp:inline distT="0" distB="0" distL="0" distR="0" wp14:anchorId="6BC1F6C1" wp14:editId="72A266FA">
             <wp:extent cx="1991034" cy="2328074"/>
@@ -3645,7 +3905,17 @@
         </w:numPr>
       </w:pPr>
       <w:r>
-        <w:t>Search for USA Cities owner:GTKMobileGIS.</w:t>
+        <w:t xml:space="preserve">Search for USA Cities </w:t>
+      </w:r>
+      <w:proofErr w:type="spellStart"/>
+      <w:proofErr w:type="gramStart"/>
+      <w:r>
+        <w:t>owner:GTKMobileGIS</w:t>
+      </w:r>
+      <w:proofErr w:type="spellEnd"/>
+      <w:proofErr w:type="gramEnd"/>
+      <w:r>
+        <w:t>.</w:t>
       </w:r>
     </w:p>
     <w:p>
@@ -3764,24 +4034,24 @@
         </w:numPr>
       </w:pPr>
       <w:r>
+        <w:t>Click a city to see the attributes in the pop-up. Notice it has a Name field.</w:t>
+      </w:r>
+    </w:p>
+    <w:p>
+      <w:pPr>
+        <w:pStyle w:val="ListParagraph"/>
+      </w:pPr>
+    </w:p>
+    <w:p>
+      <w:pPr>
+        <w:pStyle w:val="ListParagraph"/>
+        <w:ind w:left="1440"/>
+      </w:pPr>
+      <w:r>
+        <w:rPr>
+          <w:noProof/>
+        </w:rPr>
         <w:lastRenderedPageBreak/>
-        <w:t>Click a city to see the attributes in the pop-up. Notice it has a Name field.</w:t>
-      </w:r>
-    </w:p>
-    <w:p>
-      <w:pPr>
-        <w:pStyle w:val="ListParagraph"/>
-      </w:pPr>
-    </w:p>
-    <w:p>
-      <w:pPr>
-        <w:pStyle w:val="ListParagraph"/>
-        <w:ind w:left="1440"/>
-      </w:pPr>
-      <w:r>
-        <w:rPr>
-          <w:noProof/>
-        </w:rPr>
         <w:drawing>
           <wp:inline distT="0" distB="0" distL="0" distR="0" wp14:anchorId="098637E6" wp14:editId="4C2241A9">
             <wp:extent cx="3193621" cy="2109291"/>
@@ -4000,15 +4270,15 @@
         </w:numPr>
       </w:pPr>
       <w:r>
+        <w:t>Close Map Viewer.</w:t>
+      </w:r>
+    </w:p>
+    <w:p>
+      <w:pPr>
+        <w:ind w:left="360"/>
+      </w:pPr>
+      <w:r>
         <w:lastRenderedPageBreak/>
-        <w:t>Close Map Viewer.</w:t>
-      </w:r>
-    </w:p>
-    <w:p>
-      <w:pPr>
-        <w:ind w:left="360"/>
-      </w:pPr>
-      <w:r>
         <w:t>You are directed back to Field Maps Designer. Your web map is reloaded automatically to ensure that you work with the latest of your web maps.</w:t>
       </w:r>
     </w:p>
@@ -4021,7 +4291,15 @@
         </w:numPr>
       </w:pPr>
       <w:r>
-        <w:t>On the form for the Point Assets layer, click the City element.</w:t>
+        <w:t xml:space="preserve">On the form for the Point Assets layer, click the </w:t>
+      </w:r>
+      <w:proofErr w:type="gramStart"/>
+      <w:r>
+        <w:t>City</w:t>
+      </w:r>
+      <w:proofErr w:type="gramEnd"/>
+      <w:r>
+        <w:t xml:space="preserve"> element.</w:t>
       </w:r>
     </w:p>
     <w:p>
@@ -4100,7 +4378,32 @@
           <w:rFonts w:ascii="Times New Roman" w:hAnsi="Times New Roman" w:cs="Times New Roman"/>
           <w:shd w:val="pct15" w:color="auto" w:fill="FFFFFF"/>
         </w:rPr>
-        <w:t>var cities = FeatureSetByName($map, "USA Cities", ["NAME"]);</w:t>
+        <w:t xml:space="preserve">var cities = </w:t>
+      </w:r>
+      <w:proofErr w:type="spellStart"/>
+      <w:proofErr w:type="gramStart"/>
+      <w:r>
+        <w:rPr>
+          <w:rFonts w:ascii="Times New Roman" w:hAnsi="Times New Roman" w:cs="Times New Roman"/>
+          <w:shd w:val="pct15" w:color="auto" w:fill="FFFFFF"/>
+        </w:rPr>
+        <w:t>FeatureSetByName</w:t>
+      </w:r>
+      <w:proofErr w:type="spellEnd"/>
+      <w:r>
+        <w:rPr>
+          <w:rFonts w:ascii="Times New Roman" w:hAnsi="Times New Roman" w:cs="Times New Roman"/>
+          <w:shd w:val="pct15" w:color="auto" w:fill="FFFFFF"/>
+        </w:rPr>
+        <w:t>(</w:t>
+      </w:r>
+      <w:proofErr w:type="gramEnd"/>
+      <w:r>
+        <w:rPr>
+          <w:rFonts w:ascii="Times New Roman" w:hAnsi="Times New Roman" w:cs="Times New Roman"/>
+          <w:shd w:val="pct15" w:color="auto" w:fill="FFFFFF"/>
+        </w:rPr>
+        <w:t>$map, "USA Cities", ["NAME"]);</w:t>
       </w:r>
     </w:p>
     <w:p>
@@ -4117,7 +4420,23 @@
           <w:rFonts w:ascii="Times New Roman" w:hAnsi="Times New Roman" w:cs="Times New Roman"/>
           <w:shd w:val="pct15" w:color="auto" w:fill="FFFFFF"/>
         </w:rPr>
-        <w:t>var city = First(Intersects($feature, cities));</w:t>
+        <w:t xml:space="preserve">var city = </w:t>
+      </w:r>
+      <w:proofErr w:type="gramStart"/>
+      <w:r>
+        <w:rPr>
+          <w:rFonts w:ascii="Times New Roman" w:hAnsi="Times New Roman" w:cs="Times New Roman"/>
+          <w:shd w:val="pct15" w:color="auto" w:fill="FFFFFF"/>
+        </w:rPr>
+        <w:t>First(</w:t>
+      </w:r>
+      <w:proofErr w:type="gramEnd"/>
+      <w:r>
+        <w:rPr>
+          <w:rFonts w:ascii="Times New Roman" w:hAnsi="Times New Roman" w:cs="Times New Roman"/>
+          <w:shd w:val="pct15" w:color="auto" w:fill="FFFFFF"/>
+        </w:rPr>
+        <w:t>Intersects($feature, cities));</w:t>
       </w:r>
     </w:p>
     <w:p>
@@ -4134,7 +4453,32 @@
           <w:rFonts w:ascii="Times New Roman" w:hAnsi="Times New Roman" w:cs="Times New Roman"/>
           <w:shd w:val="pct15" w:color="auto" w:fill="FFFFFF"/>
         </w:rPr>
-        <w:t>if (!IsEmpty(city)) {</w:t>
+        <w:t xml:space="preserve">if </w:t>
+      </w:r>
+      <w:proofErr w:type="gramStart"/>
+      <w:r>
+        <w:rPr>
+          <w:rFonts w:ascii="Times New Roman" w:hAnsi="Times New Roman" w:cs="Times New Roman"/>
+          <w:shd w:val="pct15" w:color="auto" w:fill="FFFFFF"/>
+        </w:rPr>
+        <w:t>(!</w:t>
+      </w:r>
+      <w:proofErr w:type="spellStart"/>
+      <w:r>
+        <w:rPr>
+          <w:rFonts w:ascii="Times New Roman" w:hAnsi="Times New Roman" w:cs="Times New Roman"/>
+          <w:shd w:val="pct15" w:color="auto" w:fill="FFFFFF"/>
+        </w:rPr>
+        <w:t>IsEmpty</w:t>
+      </w:r>
+      <w:proofErr w:type="spellEnd"/>
+      <w:proofErr w:type="gramEnd"/>
+      <w:r>
+        <w:rPr>
+          <w:rFonts w:ascii="Times New Roman" w:hAnsi="Times New Roman" w:cs="Times New Roman"/>
+          <w:shd w:val="pct15" w:color="auto" w:fill="FFFFFF"/>
+        </w:rPr>
+        <w:t>(city)) {</w:t>
       </w:r>
     </w:p>
     <w:p>
@@ -4151,8 +4495,17 @@
           <w:rFonts w:ascii="Times New Roman" w:hAnsi="Times New Roman" w:cs="Times New Roman"/>
           <w:shd w:val="pct15" w:color="auto" w:fill="FFFFFF"/>
         </w:rPr>
-        <w:t>return city["NAME"];</w:t>
-      </w:r>
+        <w:t>return city["NAME"</w:t>
+      </w:r>
+      <w:proofErr w:type="gramStart"/>
+      <w:r>
+        <w:rPr>
+          <w:rFonts w:ascii="Times New Roman" w:hAnsi="Times New Roman" w:cs="Times New Roman"/>
+          <w:shd w:val="pct15" w:color="auto" w:fill="FFFFFF"/>
+        </w:rPr>
+        <w:t>];</w:t>
+      </w:r>
+      <w:proofErr w:type="gramEnd"/>
     </w:p>
     <w:p>
       <w:pPr>
@@ -4185,8 +4538,17 @@
           <w:rFonts w:ascii="Times New Roman" w:hAnsi="Times New Roman" w:cs="Times New Roman"/>
           <w:shd w:val="pct15" w:color="auto" w:fill="FFFFFF"/>
         </w:rPr>
-        <w:t>return null;</w:t>
-      </w:r>
+        <w:t xml:space="preserve">return </w:t>
+      </w:r>
+      <w:proofErr w:type="gramStart"/>
+      <w:r>
+        <w:rPr>
+          <w:rFonts w:ascii="Times New Roman" w:hAnsi="Times New Roman" w:cs="Times New Roman"/>
+          <w:shd w:val="pct15" w:color="auto" w:fill="FFFFFF"/>
+        </w:rPr>
+        <w:t>null;</w:t>
+      </w:r>
+      <w:proofErr w:type="gramEnd"/>
     </w:p>
     <w:p>
       <w:pPr>
@@ -4290,7 +4652,15 @@
         <w:ind w:left="360"/>
       </w:pPr>
       <w:r>
-        <w:t>The script first gets the USA Cities layer, along with the geometries and the Name field from your web map, and then uses the current asset point to intersect with the cities polygon layer. If there is an intersecting city, the script returns the city’s Name attribute value; otherwise, it returns null.</w:t>
+        <w:t xml:space="preserve">The script first gets the USA Cities layer, along with the geometries and the Name field from your web map, and then uses the current asset point to intersect with the </w:t>
+      </w:r>
+      <w:proofErr w:type="gramStart"/>
+      <w:r>
+        <w:t>cities</w:t>
+      </w:r>
+      <w:proofErr w:type="gramEnd"/>
+      <w:r>
+        <w:t xml:space="preserve"> polygon layer. If there is an intersecting city, the script returns the city’s Name attribute value; otherwise, it returns null.</w:t>
       </w:r>
     </w:p>
     <w:p>
@@ -5723,7 +6093,23 @@
       </w:pPr>
       <w:r>
         <w:lastRenderedPageBreak/>
-        <w:t>Notice the option Keep Track of Who Edited the Data is selected. This adds four editor tracking fields to your layer: CreationDate, Creator, EditDate, and Editor. The field names may vary.</w:t>
+        <w:t xml:space="preserve">Notice the option Keep Track of Who Edited the Data is selected. This adds four editor tracking fields to your layer: </w:t>
+      </w:r>
+      <w:proofErr w:type="spellStart"/>
+      <w:r>
+        <w:t>CreationDate</w:t>
+      </w:r>
+      <w:proofErr w:type="spellEnd"/>
+      <w:r>
+        <w:t xml:space="preserve">, Creator, </w:t>
+      </w:r>
+      <w:proofErr w:type="spellStart"/>
+      <w:r>
+        <w:t>EditDate</w:t>
+      </w:r>
+      <w:proofErr w:type="spellEnd"/>
+      <w:r>
+        <w:t>, and Editor. The field names may vary.</w:t>
       </w:r>
     </w:p>
     <w:p>
@@ -5735,7 +6121,15 @@
         </w:numPr>
       </w:pPr>
       <w:r>
-        <w:t>Notice the Enable Sync option. This option is needed for offline support, and it adds the GlobalID field to your layer.</w:t>
+        <w:t xml:space="preserve">Notice the Enable Sync option. This option is needed for offline support, and it adds the </w:t>
+      </w:r>
+      <w:proofErr w:type="spellStart"/>
+      <w:r>
+        <w:t>GlobalID</w:t>
+      </w:r>
+      <w:proofErr w:type="spellEnd"/>
+      <w:r>
+        <w:t xml:space="preserve"> field to your layer.</w:t>
       </w:r>
     </w:p>
     <w:p>
@@ -5856,8 +6250,21 @@
           <w:numId w:val="60"/>
         </w:numPr>
       </w:pPr>
-      <w:r>
-        <w:t>CreationDate, Creator, EditDate, and Editor are editor tracking fields.</w:t>
+      <w:proofErr w:type="spellStart"/>
+      <w:r>
+        <w:t>CreationDate</w:t>
+      </w:r>
+      <w:proofErr w:type="spellEnd"/>
+      <w:r>
+        <w:t xml:space="preserve">, Creator, </w:t>
+      </w:r>
+      <w:proofErr w:type="spellStart"/>
+      <w:r>
+        <w:t>EditDate</w:t>
+      </w:r>
+      <w:proofErr w:type="spellEnd"/>
+      <w:r>
+        <w:t>, and Editor are editor tracking fields.</w:t>
       </w:r>
     </w:p>
     <w:p>
@@ -5868,8 +6275,13 @@
           <w:numId w:val="60"/>
         </w:numPr>
       </w:pPr>
-      <w:r>
-        <w:t>GlobalID field.</w:t>
+      <w:proofErr w:type="spellStart"/>
+      <w:r>
+        <w:t>GlobalID</w:t>
+      </w:r>
+      <w:proofErr w:type="spellEnd"/>
+      <w:r>
+        <w:t xml:space="preserve"> field.</w:t>
       </w:r>
     </w:p>
     <w:p>
@@ -6004,15 +6416,21 @@
     <w:p>
       <w:pPr>
         <w:ind w:left="360"/>
+      </w:pPr>
+      <w:r>
         <w:rPr>
           <w:rFonts w:hint="eastAsia"/>
         </w:rPr>
-      </w:pPr>
+        <w:t xml:space="preserve">Content </w:t>
+      </w:r>
+      <w:r>
+        <w:t>–</w:t>
+      </w:r>
       <w:r>
         <w:rPr>
           <w:rFonts w:hint="eastAsia"/>
         </w:rPr>
-        <w:t xml:space="preserve">Content </w:t>
+        <w:t xml:space="preserve"> My content </w:t>
       </w:r>
       <w:r>
         <w:t>–</w:t>
@@ -6021,7 +6439,7 @@
         <w:rPr>
           <w:rFonts w:hint="eastAsia"/>
         </w:rPr>
-        <w:t xml:space="preserve"> My content </w:t>
+        <w:t xml:space="preserve"> Week 05 Field Map </w:t>
       </w:r>
       <w:r>
         <w:t>–</w:t>
@@ -6030,24 +6448,12 @@
         <w:rPr>
           <w:rFonts w:hint="eastAsia"/>
         </w:rPr>
-        <w:t xml:space="preserve"> Week 05 Field Map </w:t>
-      </w:r>
-      <w:r>
-        <w:t>–</w:t>
-      </w:r>
-      <w:r>
-        <w:rPr>
-          <w:rFonts w:hint="eastAsia"/>
-        </w:rPr>
         <w:t xml:space="preserve"> Asset Inventory</w:t>
       </w:r>
     </w:p>
     <w:p>
       <w:pPr>
         <w:ind w:left="360"/>
-        <w:rPr>
-          <w:rFonts w:hint="eastAsia"/>
-        </w:rPr>
       </w:pPr>
       <w:r>
         <w:rPr>
@@ -6427,9 +6833,6 @@
     <w:p>
       <w:pPr>
         <w:ind w:left="360"/>
-        <w:rPr>
-          <w:rFonts w:hint="eastAsia"/>
-        </w:rPr>
       </w:pPr>
       <w:r>
         <w:rPr>
@@ -6449,7 +6852,7 @@
 </file>
 
 <file path=word/numbering.xml><?xml version="1.0" encoding="utf-8"?>
-<w:numbering xmlns:wpc="http://schemas.microsoft.com/office/word/2010/wordprocessingCanvas" xmlns:cx="http://schemas.microsoft.com/office/drawing/2014/chartex" xmlns:cx1="http://schemas.microsoft.com/office/drawing/2015/9/8/chartex" xmlns:cx2="http://schemas.microsoft.com/office/drawing/2015/10/21/chartex" xmlns:cx3="http://schemas.microsoft.com/office/drawing/2016/5/9/chartex" xmlns:cx4="http://schemas.microsoft.com/office/drawing/2016/5/10/chartex" xmlns:cx5="http://schemas.microsoft.com/office/drawing/2016/5/11/chartex" xmlns:cx6="http://schemas.microsoft.com/office/drawing/2016/5/12/chartex" xmlns:cx7="http://schemas.microsoft.com/office/drawing/2016/5/13/chartex" xmlns:cx8="http://schemas.microsoft.com/office/drawing/2016/5/14/chartex" xmlns:mc="http://schemas.openxmlformats.org/markup-compatibility/2006" xmlns:aink="http://schemas.microsoft.com/office/drawing/2016/ink" xmlns:am3d="http://schemas.microsoft.com/office/drawing/2017/model3d" xmlns:o="urn:schemas-microsoft-com:office:office" xmlns:oel="http://schemas.microsoft.com/office/2019/extlst" xmlns:r="http://schemas.openxmlformats.org/officeDocument/2006/relationships" xmlns:m="http://schemas.openxmlformats.org/officeDocument/2006/math" xmlns:v="urn:schemas-microsoft-com:vml" xmlns:wp14="http://schemas.microsoft.com/office/word/2010/wordprocessingDrawing" xmlns:wp="http://schemas.openxmlformats.org/drawingml/2006/wordprocessingDrawing" xmlns:w10="urn:schemas-microsoft-com:office:word" xmlns:w="http://schemas.openxmlformats.org/wordprocessingml/2006/main" xmlns:w14="http://schemas.microsoft.com/office/word/2010/wordml" xmlns:w15="http://schemas.microsoft.com/office/word/2012/wordml" xmlns:w16cex="http://schemas.microsoft.com/office/word/2018/wordml/cex" xmlns:w16cid="http://schemas.microsoft.com/office/word/2016/wordml/cid" xmlns:w16="http://schemas.microsoft.com/office/word/2018/wordml" xmlns:w16du="http://schemas.microsoft.com/office/word/2023/wordml/word16du" xmlns:w16sdtdh="http://schemas.microsoft.com/office/word/2020/wordml/sdtdatahash" xmlns:w16sdtfl="http://schemas.microsoft.com/office/word/2024/wordml/sdtformatlock" xmlns:w16se="http://schemas.microsoft.com/office/word/2015/wordml/symex" xmlns:wpg="http://schemas.microsoft.com/office/word/2010/wordprocessingGroup" xmlns:wpi="http://schemas.microsoft.com/office/word/2010/wordprocessingInk" xmlns:wne="http://schemas.microsoft.com/office/word/2006/wordml" xmlns:wps="http://schemas.microsoft.com/office/word/2010/wordprocessingShape" mc:Ignorable="w14 w15 w16se w16cid w16 w16cex w16sdtdh w16sdtfl w16du wp14">
+<w:numbering xmlns:wpc="http://schemas.microsoft.com/office/word/2010/wordprocessingCanvas" xmlns:cx="http://schemas.microsoft.com/office/drawing/2014/chartex" xmlns:cx1="http://schemas.microsoft.com/office/drawing/2015/9/8/chartex" xmlns:cx2="http://schemas.microsoft.com/office/drawing/2015/10/21/chartex" xmlns:cx3="http://schemas.microsoft.com/office/drawing/2016/5/9/chartex" xmlns:cx4="http://schemas.microsoft.com/office/drawing/2016/5/10/chartex" xmlns:cx5="http://schemas.microsoft.com/office/drawing/2016/5/11/chartex" xmlns:cx6="http://schemas.microsoft.com/office/drawing/2016/5/12/chartex" xmlns:cx7="http://schemas.microsoft.com/office/drawing/2016/5/13/chartex" xmlns:cx8="http://schemas.microsoft.com/office/drawing/2016/5/14/chartex" xmlns:mc="http://schemas.openxmlformats.org/markup-compatibility/2006" xmlns:aink="http://schemas.microsoft.com/office/drawing/2016/ink" xmlns:am3d="http://schemas.microsoft.com/office/drawing/2017/model3d" xmlns:o="urn:schemas-microsoft-com:office:office" xmlns:oel="http://schemas.microsoft.com/office/2019/extlst" xmlns:r="http://schemas.openxmlformats.org/officeDocument/2006/relationships" xmlns:m="http://schemas.openxmlformats.org/officeDocument/2006/math" xmlns:v="urn:schemas-microsoft-com:vml" xmlns:wp14="http://schemas.microsoft.com/office/word/2010/wordprocessingDrawing" xmlns:wp="http://schemas.openxmlformats.org/drawingml/2006/wordprocessingDrawing" xmlns:w10="urn:schemas-microsoft-com:office:word" xmlns:w="http://schemas.openxmlformats.org/wordprocessingml/2006/main" xmlns:w14="http://schemas.microsoft.com/office/word/2010/wordml" xmlns:w15="http://schemas.microsoft.com/office/word/2012/wordml" xmlns:w16cex="http://schemas.microsoft.com/office/word/2018/wordml/cex" xmlns:w16cid="http://schemas.microsoft.com/office/word/2016/wordml/cid" xmlns:w16="http://schemas.microsoft.com/office/word/2018/wordml" xmlns:w16sdtdh="http://schemas.microsoft.com/office/word/2020/wordml/sdtdatahash" xmlns:w16se="http://schemas.microsoft.com/office/word/2015/wordml/symex" xmlns:wpg="http://schemas.microsoft.com/office/word/2010/wordprocessingGroup" xmlns:wpi="http://schemas.microsoft.com/office/word/2010/wordprocessingInk" xmlns:wne="http://schemas.microsoft.com/office/word/2006/wordml" xmlns:wps="http://schemas.microsoft.com/office/word/2010/wordprocessingShape" mc:Ignorable="w14 w15 w16se w16cid w16 w16cex w16sdtdh wp14">
   <w:abstractNum w:abstractNumId="0" w15:restartNumberingAfterBreak="0">
     <w:nsid w:val="041B2974"/>
     <w:multiLevelType w:val="hybridMultilevel"/>
@@ -12885,7 +13288,7 @@
 </file>
 
 <file path=word/styles.xml><?xml version="1.0" encoding="utf-8"?>
-<w:styles xmlns:mc="http://schemas.openxmlformats.org/markup-compatibility/2006" xmlns:r="http://schemas.openxmlformats.org/officeDocument/2006/relationships" xmlns:w="http://schemas.openxmlformats.org/wordprocessingml/2006/main" xmlns:w14="http://schemas.microsoft.com/office/word/2010/wordml" xmlns:w15="http://schemas.microsoft.com/office/word/2012/wordml" xmlns:w16cex="http://schemas.microsoft.com/office/word/2018/wordml/cex" xmlns:w16cid="http://schemas.microsoft.com/office/word/2016/wordml/cid" xmlns:w16="http://schemas.microsoft.com/office/word/2018/wordml" xmlns:w16du="http://schemas.microsoft.com/office/word/2023/wordml/word16du" xmlns:w16sdtdh="http://schemas.microsoft.com/office/word/2020/wordml/sdtdatahash" xmlns:w16sdtfl="http://schemas.microsoft.com/office/word/2024/wordml/sdtformatlock" xmlns:w16se="http://schemas.microsoft.com/office/word/2015/wordml/symex" mc:Ignorable="w14 w15 w16se w16cid w16 w16cex w16sdtdh w16sdtfl w16du">
+<w:styles xmlns:mc="http://schemas.openxmlformats.org/markup-compatibility/2006" xmlns:r="http://schemas.openxmlformats.org/officeDocument/2006/relationships" xmlns:w="http://schemas.openxmlformats.org/wordprocessingml/2006/main" xmlns:w14="http://schemas.microsoft.com/office/word/2010/wordml" xmlns:w15="http://schemas.microsoft.com/office/word/2012/wordml" xmlns:w16cex="http://schemas.microsoft.com/office/word/2018/wordml/cex" xmlns:w16cid="http://schemas.microsoft.com/office/word/2016/wordml/cid" xmlns:w16="http://schemas.microsoft.com/office/word/2018/wordml" xmlns:w16sdtdh="http://schemas.microsoft.com/office/word/2020/wordml/sdtdatahash" xmlns:w16se="http://schemas.microsoft.com/office/word/2015/wordml/symex" mc:Ignorable="w14 w15 w16se w16cid w16 w16cex w16sdtdh">
   <w:docDefaults>
     <w:rPrDefault>
       <w:rPr>

</xml_diff>